<commit_message>
Regenerate the 24 Aug Signal with the rebuilt generator (the committed copy was stale)
The generator rebuild was committed but the 24 Aug output stayed on the old
version: signal_note is idempotent per week (CI skipped it) and my earlier
'git checkout -- reports/signals' reverted the freshly generated file. Force
the current output in: 1033 words with the data-cut timestamp, 72% (not 73%),
'a power-law fit' not 'actually holds', 'six of the seven displayed FX pairs',
the in-sample floor caveat, backtested-vs-live, what-changed, watchlist and the
score-next-week claim.

Co-Authored-By: Claude Opus 4.8 <noreply@anthropic.com>
</commit_message>
<xml_diff>
--- a/reports/signals/docx/levanter-signal-2026-08-24.docx
+++ b/reports/signals/docx/levanter-signal-2026-08-24.docx
@@ -11,23 +11,61 @@
       </w:r>
     </w:p>
     <w:p>
+      <w:pPr>
+        <w:ind w:left="432"/>
+      </w:pPr>
+      <w:r>
+        <w:rPr>
+          <w:b/>
+        </w:rPr>
+        <w:t>New: the Levanter Signal, a weekly newsletter.</w:t>
+      </w:r>
+      <w:r>
+        <w:t xml:space="preserve"> This is the first issue. It reads volatility, valuation and the week ahead across crypto, foreign exchange and commodities, and it is honest about what a model can and cannot forecast. It is </w:t>
+      </w:r>
+      <w:r>
+        <w:rPr>
+          <w:b/>
+        </w:rPr>
+        <w:t>free this week and next</w:t>
+      </w:r>
+      <w:r>
+        <w:t xml:space="preserve">, then it moves to subscribers. Subscribe at </w:t>
+      </w:r>
+      <w:hyperlink r:id="rId9">
+        <w:r>
+          <w:rPr>
+            <w:color w:val="1155CC"/>
+            <w:u w:val="single"/>
+          </w:rPr>
+          <w:t>read.levantermarkets.com</w:t>
+        </w:r>
+      </w:hyperlink>
+      <w:r>
+        <w:t xml:space="preserve"> to keep it.</w:t>
+      </w:r>
+    </w:p>
+    <w:p>
       <w:r>
         <w:rPr>
           <w:i/>
         </w:rPr>
-        <w:t>The weekly premium note. One chart that matters, the volatility read across crypto, foreign exchange and commodities, and a plain line on what is and is not knowable from here.</w:t>
+        <w:t>Data captured at 19:04 GST on 24 August 2026. Every figure below is stamped to a period, because they move. This is the accountable read behind the free weekly: the changes since last week, the levels to watch, and a claim we will score in the next issue.</w:t>
       </w:r>
     </w:p>
     <w:p/>
     <w:p>
+      <w:pPr>
+        <w:ind w:left="432"/>
+      </w:pPr>
       <w:r>
         <w:rPr>
           <w:b/>
         </w:rPr>
-        <w:t>The one line:</w:t>
+        <w:t>Editor's line (add before publishing, then delete this prompt):</w:t>
       </w:r>
       <w:r>
-        <w:t xml:space="preserve"> expect the wider ranges in the metals and big-cap crypto, calmer trade in foreign exchange and energy, and remember that bitcoin looks cheap on a decade view and a coin flip on a weekly one.</w:t>
+        <w:t xml:space="preserve"> one sentence of your own read of the week. Two minutes. What it means for how you are positioned, or the single thing you would tell a friend who asked. This is the line the model cannot write.</w:t>
       </w:r>
     </w:p>
     <w:p>
@@ -35,22 +73,17 @@
         <w:pStyle w:val="Heading1"/>
       </w:pPr>
       <w:r>
-        <w:t>The one chart that matters</w:t>
+        <w:t>The one chart: bitcoin against its adoption model</w:t>
       </w:r>
     </w:p>
     <w:p>
       <w:r>
-        <w:t>Bitcoin is trading around 78,000 dollars. Against its long-term adoption trend, the model that actually holds for bitcoin, fair value sits near 135,000. That is roughly 42 percent below trend, with the adoption floor around 59,000, a line that has held about 95 percent of the time in bitcoin's history.</w:t>
+        <w:t>Bitcoin is near 78,000 dollars, captured 19:04 GST on 24 August 2026. We value it against network age with a power-law fit. Fair value on that fit lands near 135,000, about 42 percent below the line, and the fitted floor sits near 59,000. Bitcoin has closed above that floor line for roughly 95 percent of the historical sample. That is an in-sample observation, not a tested probability and not a guaranteed level of support.</w:t>
       </w:r>
     </w:p>
     <w:p>
       <w:r>
-        <w:t>The cycle clock agrees: bitcoin is about 45 percent below its power-law trend and reads as post-peak cooldown.</w:t>
-      </w:r>
-    </w:p>
-    <w:p>
-      <w:r>
-        <w:t>Read that correctly. It is not a price target and it is not a buy signal. It is a statement about where bitcoin sits versus its own network on a multi-year horizon. The honest caveat, which is the whole point of Levanter, is that this tells you nothing about next week. Both readings are true at once.</w:t>
+        <w:t>A separate cycle model classifies bitcoin as post-peak cooldown, about 43 percent below its own power-law trend. Both are long-horizon context. Where price sits against a multi-year fit says nothing about the next five days, so read it as valuation, not a reason to act on the week.</w:t>
       </w:r>
     </w:p>
     <w:p>
@@ -58,7 +91,7 @@
         <w:rPr>
           <w:i/>
         </w:rPr>
-        <w:t>(Chart: bitcoin price against its adoption fair value and floor. Attached.)</w:t>
+        <w:t>(Chart: bitcoin price against its adoption fair value and floor.)</w:t>
       </w:r>
     </w:p>
     <w:p>
@@ -66,27 +99,12 @@
         <w:pStyle w:val="Heading1"/>
       </w:pPr>
       <w:r>
-        <w:t>The volatility read, week ahead</w:t>
+        <w:t>What the model can and cannot do</w:t>
       </w:r>
     </w:p>
     <w:p>
       <w:r>
-        <w:t>This is the part the model is actually good at. Volatility clusters, so a turbulent-or-calm call carries real skill, backtested at 66 percent over seven days and 73 percent over a month, 74 percent over a quarter. Here is where it points for the coming week.</w:t>
-      </w:r>
-    </w:p>
-    <w:p>
-      <w:r>
-        <w:t>The turbulence is concentrated, and it is worth knowing where. The precious metals are the loudest room in the building, with gold, silver and platinum all reading high volatility. Big-cap crypto is lively, with bitcoin and ether flagged turbulent while solana sits calmer.</w:t>
-      </w:r>
-    </w:p>
-    <w:p>
-      <w:r>
-        <w:t>The quiet is just as useful. Foreign exchange is broadly asleep, with 6 of the majors reading low and only the Swiss franc showing life. Energy is calm too, with oil, copper and natural gas all low.</w:t>
-      </w:r>
-    </w:p>
-    <w:p>
-      <w:r>
-        <w:t>So the map is simple. Where the model reads high, plan for wider ranges and size accordingly. Where it reads low, expect a tighter, less eventful week. This is not a direction call on any of them. It is a heads-up on where the range is likely to be widest, which is where position sizing and stops actually matter.</w:t>
+        <w:t>The limits matter more than the headline. The power law is a fit of price to time. It has no economic mechanism behind it, it cannot call tops, and a line that holds in the historical sample can break out of it. It is a valuation anchor, not a timing tool. Treat the fair value and the floor as distant reference points, never as targets and never as a reason to size up.</w:t>
       </w:r>
     </w:p>
     <w:p>
@@ -94,17 +112,27 @@
         <w:pStyle w:val="Heading1"/>
       </w:pPr>
       <w:r>
-        <w:t>What the tape is telling you underneath</w:t>
+        <w:t>The seven-day volatility map</w:t>
       </w:r>
     </w:p>
     <w:p>
       <w:r>
-        <w:t>Crypto is risk-on, the market is up about 22 percent over the past month, and bitcoin dominance sits near 68 percent. The best performer on the board is PUMP at +171 percent while M lags at -8 percent. When the biggest moves cluster in the most speculative names, the tape is telling you risk appetite is running a little ahead of conviction. That is not a sell signal. It is a reason to keep your stops honest.</w:t>
+        <w:t>This is the part with measurable skill. The model tags each market turbulent or calm for the week ahead. Against a 50 percent coin-flip baseline it is right about 66 percent of the time at seven days and 72 percent at thirty, backtested point-in-time over five years on non-overlapping samples. That is a backtest, not a live forward record: the live scoreboard is only now starting to fill.</w:t>
       </w:r>
     </w:p>
     <w:p>
       <w:r>
-        <w:t>In commodities, the split is wide: wheat leads at +19 percent and palladium lags at -14 percent.</w:t>
+        <w:t>For the coming week the model reads six markets turbulent: bitcoin, ether, gold, silver, platinum and the Swiss franc. The rest is calm, including six of the seven displayed FX pairs, the S&amp;P, and oil, copper and natural gas in energy. So the average market is contained while the turbulence is concentrated, which settles the apparent tension in the free weekly between a mostly-calm board and loud pockets. Both are true, because only the metals and big crypto are carrying the range.</w:t>
+      </w:r>
+    </w:p>
+    <w:p>
+      <w:r>
+        <w:t>The loudest reads are in big crypto. Bitcoin's one-week volatility is near 54 percent against a 39 median, and ether near 101 against 53, close to double its normal. Both are turbulent on the week while their one-month regime is still calm, so this is a near-term spike rather than a change of character. The metals read turbulent on both the one-week and one-month horizons, so their wider ranges are more persistent.</w:t>
+      </w:r>
+    </w:p>
+    <w:p>
+      <w:r>
+        <w:t>On direction the model is close to a coin flip, which is the thesis rather than a shortfall: 49 percent over 320 backtested crypto calls, the class with the most data. The full per-class breakdown, and why the commodities figure is not an edge, sit on the track record. We forecast volatility, not direction.</w:t>
       </w:r>
     </w:p>
     <w:p>
@@ -112,20 +140,114 @@
         <w:pStyle w:val="Heading1"/>
       </w:pPr>
       <w:r>
-        <w:t>What is and is not knowable</w:t>
+        <w:t>What changed since the last Signal</w:t>
       </w:r>
     </w:p>
     <w:p>
       <w:r>
-        <w:t>So the knowable this week: where the volatility is, where the calm is, and where bitcoin sits on a long-horizon valuation. The unknowable: which way any of them closes on Friday. We will not sell you the second one dressed as the first.</w:t>
+        <w:t>This is the first issue, so there is no prior Signal to compare against. From next week this section flags which markets newly flipped turbulent or calm and how far bitcoin moved against its fitted value, so you see the model changing its mind, not just its latest state.</w:t>
+      </w:r>
+    </w:p>
+    <w:p>
+      <w:pPr>
+        <w:pStyle w:val="Heading1"/>
+      </w:pPr>
+      <w:r>
+        <w:t>The week behind, and what it rhymes with</w:t>
+      </w:r>
+    </w:p>
+    <w:p>
+      <w:r>
+        <w:t>Over the past seven days crypto was broad and speculative-led: 32 of 35 coins higher, cap-weighted about +26 percent on the week and +26 percent over thirty days, led by the speculative end, PUMP +71 percent and ZEC +68 percent, with a best-to-worst spread near 74 points. Dominance held near 68 percent and the stablecoins we track kept their pegs. In foreign exchange the biggest seven-day move was NZDUSD at +1.2 percent, ranges otherwise tight. In commodities the metals led the week, platinum +7 percent, gold +7 percent and silver +4 percent. Risk appetite is running in the tail while the majors and the dollar sit quiet.</w:t>
+      </w:r>
+    </w:p>
+    <w:p>
+      <w:pPr>
+        <w:pStyle w:val="Heading1"/>
+      </w:pPr>
+      <w:r>
+        <w:t>Subscriber watchlist, with levels</w:t>
+      </w:r>
+    </w:p>
+    <w:p>
+      <w:pPr>
+        <w:pStyle w:val="ListBullet"/>
+      </w:pPr>
+      <w:r>
+        <w:rPr>
+          <w:b/>
+        </w:rPr>
+        <w:t>Bitcoin.</w:t>
+      </w:r>
+      <w:r>
+        <w:t xml:space="preserve"> Fitted floor near 59,000, fair value near 135,000. A weekly close below the floor line would be the first in most of the sample.</w:t>
+      </w:r>
+    </w:p>
+    <w:p>
+      <w:pPr>
+        <w:pStyle w:val="ListBullet"/>
+      </w:pPr>
+      <w:r>
+        <w:rPr>
+          <w:b/>
+        </w:rPr>
+        <w:t>Ether volatility.</w:t>
+      </w:r>
+      <w:r>
+        <w:t xml:space="preserve"> Watch it fall back toward its 53 median. Holding near 101 would turn the spike into a regime.</w:t>
+      </w:r>
+    </w:p>
+    <w:p>
+      <w:pPr>
+        <w:pStyle w:val="ListBullet"/>
+      </w:pPr>
+      <w:r>
+        <w:rPr>
+          <w:b/>
+        </w:rPr>
+        <w:t>The metals.</w:t>
+      </w:r>
+      <w:r>
+        <w:t xml:space="preserve"> Whether the turbulent bid broadens beyond gold, silver and platinum or fades back to calm.</w:t>
+      </w:r>
+    </w:p>
+    <w:p>
+      <w:pPr>
+        <w:pStyle w:val="ListBullet"/>
+      </w:pPr>
+      <w:r>
+        <w:rPr>
+          <w:b/>
+        </w:rPr>
+        <w:t>Pegs and dominance.</w:t>
+      </w:r>
+      <w:r>
+        <w:t xml:space="preserve"> Stablecoins holding, dominance near 68 percent. A peg under 0.995 or a sharp dominance move is the early risk-off tell.</w:t>
+      </w:r>
+    </w:p>
+    <w:p>
+      <w:r>
+        <w:t>To score next week: the model calls bitcoin, ether, gold, silver, platinum and the Swiss franc turbulent and the rest calm. In the next issue we mark whether those turbulent markets realised a wider-than-median weekly range and whether the calm ones stayed contained. That is the claim you can hold this Signal to.</w:t>
       </w:r>
     </w:p>
     <w:p/>
     <w:p>
       <w:r>
-        <w:t xml:space="preserve">*This is a Levanter Signal, the weekly premium note. The daily, weekly and monthly reviews stay free at </w:t>
+        <w:t xml:space="preserve">*This is the Levanter Signal, our new weekly newsletter, free this week and next. After that it moves to subscribers, so subscribe now at </w:t>
       </w:r>
       <w:hyperlink r:id="rId9">
+        <w:r>
+          <w:rPr>
+            <w:color w:val="1155CC"/>
+            <w:u w:val="single"/>
+          </w:rPr>
+          <w:t>read.levantermarkets.com</w:t>
+        </w:r>
+      </w:hyperlink>
+      <w:r>
+        <w:t xml:space="preserve"> to keep getting it. The daily, weekly and monthly reviews stay free at </w:t>
+      </w:r>
+      <w:hyperlink r:id="rId10">
         <w:r>
           <w:rPr>
             <w:color w:val="1155CC"/>
@@ -135,14 +257,14 @@
         </w:r>
       </w:hyperlink>
       <w:r>
-        <w:t>. The Signal and the alerts, a volatility-regime flip, a stablecoin starting to wobble, bitcoin touching its floor, are for subscribers. Educational market analysis, not financial advice.*</w:t>
+        <w:t>. Educational market analysis, not financial advice.*</w:t>
       </w:r>
     </w:p>
     <w:p>
       <w:r>
         <w:t xml:space="preserve">*Subscribe: </w:t>
       </w:r>
-      <w:hyperlink r:id="rId10">
+      <w:hyperlink r:id="rId9">
         <w:r>
           <w:rPr>
             <w:color w:val="1155CC"/>

</xml_diff>

<commit_message>
Signal: restore week-of-24-August issue (published 25th), drop the mis-dated 25th title
The weekly Signal is Monday-anchored (24 Aug) and published Tuesday the 25th;
regenerated from the corrected source so the title reads 'week of 24 August'
with a 25 August capture stamp.

Co-Authored-By: Claude Opus 4.8 <noreply@anthropic.com>
</commit_message>
<xml_diff>
--- a/reports/signals/docx/levanter-signal-2026-08-24.docx
+++ b/reports/signals/docx/levanter-signal-2026-08-24.docx
@@ -18,10 +18,10 @@
         <w:rPr>
           <w:b/>
         </w:rPr>
-        <w:t>New: the Levanter Signal.</w:t>
+        <w:t>The Levanter Signal.</w:t>
       </w:r>
       <w:r>
-        <w:t xml:space="preserve"> A weekly read of volatility, valuation and the week ahead across crypto, FX and commodities. It is free this week and next, then moves to subscribers. Subscribe at </w:t>
+        <w:t xml:space="preserve"> A weekly read of volatility, valuation and the week ahead across crypto, FX and commodities. This is the subscriber tier, and it is free while we build the list. We will tell you before that changes. Subscribe at </w:t>
       </w:r>
       <w:hyperlink r:id="rId9">
         <w:r>
@@ -41,7 +41,7 @@
         <w:rPr>
           <w:i/>
         </w:rPr>
-        <w:t>Data captured at 19:45 GST on 24 August 2026. Every figure below is stamped to a period. This is the accountable read behind the free weekly: the changes since last week, the levels to watch, and a claim we will score in the next issue.</w:t>
+        <w:t>Data captured at 10:16 GST on 25 August 2026. Every figure below is stamped to a period. This is the accountable read behind the free weekly: the changes since last week, the levels to watch, and a claim we will score in the next issue.</w:t>
       </w:r>
     </w:p>
     <w:p/>
@@ -64,17 +64,35 @@
         <w:pStyle w:val="Heading1"/>
       </w:pPr>
       <w:r>
-        <w:t>The one chart: bitcoin against its adoption model</w:t>
+        <w:t>The one chart: bitcoin against its long-run trend</w:t>
       </w:r>
     </w:p>
     <w:p>
       <w:r>
-        <w:t>Bitcoin is near 78,000 dollars. We value it against network age with a power-law fit. Fair value on that fit lands near 135,000, about 42 percent below the line, and the fitted floor sits near 59,000. Bitcoin has closed above that floor line for roughly 95 percent of the historical sample. That is an in-sample observation, not a tested probability and not a guaranteed level of support.</w:t>
+        <w:t xml:space="preserve">Bitcoin is near 79,000 dollars. The </w:t>
+      </w:r>
+      <w:r>
+        <w:rPr>
+          <w:b/>
+        </w:rPr>
+        <w:t>valuation fit</w:t>
+      </w:r>
+      <w:r>
+        <w:t xml:space="preserve"> models price against how long the network has existed, on a log-log scale. Fair value on that fit lands near 135,000, about 42 percent below the line, and the fitted floor sits near 59,000. Bitcoin has closed above that floor line for roughly 95 percent of the historical sample. That is an in-sample observation, not a tested probability and not a guaranteed level of support.</w:t>
       </w:r>
     </w:p>
     <w:p>
       <w:r>
-        <w:t>A separate cycle model classifies bitcoin as post-peak cooldown, about 43 percent below its own power-law trend. Both are long-horizon context. Where price sits against a multi-year fit says nothing about the next five days, so read it as valuation, not a reason to act on the week.</w:t>
+        <w:t xml:space="preserve">Our </w:t>
+      </w:r>
+      <w:r>
+        <w:rPr>
+          <w:b/>
+        </w:rPr>
+        <w:t>cycle gauge</w:t>
+      </w:r>
+      <w:r>
+        <w:t xml:space="preserve"> reports a second number, and it is worth being precise about what it is. It fits the same shape of curve, price against network age, but on a different price history and with a different band, then adds halving timing to classify the phase. It reads bitcoin as post-peak cooldown, about 43 percent below its own trend line. Do not read the two figures as confirming each other. They are the same kind of fit run over overlapping data, so close agreement is close to guaranteed and tells you nothing the first number did not. Both are long-horizon context. Where price sits against a multi-year fit says nothing about the next five days, so read it as valuation, not a reason to act on the week.</w:t>
       </w:r>
     </w:p>
     <w:p>
@@ -82,7 +100,7 @@
         <w:rPr>
           <w:i/>
         </w:rPr>
-        <w:t>(Chart: bitcoin price against its adoption fair value and floor.)</w:t>
+        <w:t>(Chart: bitcoin price against its fitted fair value and floor.)</w:t>
       </w:r>
     </w:p>
     <w:p>
@@ -108,7 +126,7 @@
     </w:p>
     <w:p>
       <w:r>
-        <w:t>This is the part with measurable skill. The model tags each market turbulent or calm for the week ahead. In the five-year point-in-time backtest it classified the seven-day regime correctly about 66 percent of the time, 11 percentage points above its naïve baseline, and 72 percent at thirty days, 16 points above baseline. That is a backtest, not a live forward record: the live scoreboard is only now starting to fill.</w:t>
+        <w:t>This is the part with measurable skill. The model tags each market turbulent or calm for the week ahead. In the five-year point-in-time backtest it classified the seven-day regime correctly about 66 percent of the time, 11 percentage points above its naïve baseline, and 73 percent at thirty days, 17 points above baseline. That is a backtest, not a live forward record: the live scoreboard is only now starting to fill.</w:t>
       </w:r>
     </w:p>
     <w:p>
@@ -118,7 +136,7 @@
     </w:p>
     <w:p>
       <w:r>
-        <w:t>The loudest reads are in big crypto. Bitcoin's one-week volatility is near 54 percent against a 39 median, and ether near 101 against 53, close to double its normal. Both are turbulent at seven days while their thirty-day classifications remain calm. The two horizons disagree, which flags a near-term disturbance without telling us whether it will last. The metals read turbulent at both seven and thirty days, indicating that their elevated-volatility classification extends beyond the coming week.</w:t>
+        <w:t>The loudest reads are in big crypto. Bitcoin's one-week volatility is near 54 percent against a 39 median, and ether near 102 against 53, close to double its normal. Both are turbulent at seven days while their thirty-day classifications remain calm. The two horizons disagree, which flags a near-term disturbance without telling us whether it will last. The metals read turbulent at both seven and thirty days, indicating that their elevated-volatility classification extends beyond the coming week.</w:t>
       </w:r>
     </w:p>
     <w:p>
@@ -149,7 +167,7 @@
     </w:p>
     <w:p>
       <w:r>
-        <w:t>Over the past seven days crypto was broad and speculative-led: 32 of 35 coins higher, cap-weighted about +26 percent on the week and +26 percent over thirty days, led by the speculative end, PUMP +71 percent and ZEC +68 percent, with a best-to-worst spread near 74 points. Dominance held near 68 percent and the stablecoins we track kept their pegs. In foreign exchange the biggest seven-day move was NZDUSD at +1.2 percent, ranges otherwise tight. In commodities the metals led the week, platinum +7 percent, gold +7 percent and silver +4 percent. The gains were broad, but the largest moves stayed further out on the risk curve, and the dollar and most FX ranges were comparatively quiet.</w:t>
+        <w:t>Over the past seven days crypto was broad and speculative-led: 32 of 35 coins higher, cap-weighted about +27 percent on the week and +26 percent over thirty days, led by the speculative end, PUMP +77 percent and ZEC +67 percent, with a best-to-worst spread near 80 points. Dominance held near 68 percent and the stablecoins we track kept their pegs. In foreign exchange the biggest seven-day move was AUDJPY at +1.0 percent, ranges otherwise tight. In commodities the metals led the week, platinum +8 percent, gold +7 percent and silver +6 percent. The gains were broad, but the largest moves stayed further out on the risk curve, and the dollar and most FX ranges were comparatively quiet.</w:t>
       </w:r>
     </w:p>
     <w:p>
@@ -190,7 +208,7 @@
         <w:t>Ether volatility.</w:t>
       </w:r>
       <w:r>
-        <w:t xml:space="preserve"> Current annualised volatility is near 101 percent against a historical median around 53. Watch whether the thirty-day classification also flips from calm to turbulent.</w:t>
+        <w:t xml:space="preserve"> Current annualised volatility is near 102 percent against a historical median around 53. Watch whether the thirty-day classification also flips from calm to turbulent.</w:t>
       </w:r>
     </w:p>
     <w:p>
@@ -229,7 +247,7 @@
     <w:p/>
     <w:p>
       <w:r>
-        <w:t xml:space="preserve">*This is the Levanter Signal, our new weekly newsletter. Subscribe at </w:t>
+        <w:t xml:space="preserve">*This is the Levanter Signal, the weekly subscriber note, free for now while we build the list. We will tell you before that changes. Subscribe at </w:t>
       </w:r>
       <w:hyperlink r:id="rId9">
         <w:r>
@@ -241,7 +259,7 @@
         </w:r>
       </w:hyperlink>
       <w:r>
-        <w:t xml:space="preserve"> to keep receiving it once the free launch ends. The daily, weekly and monthly reviews stay free at </w:t>
+        <w:t xml:space="preserve">. The daily, weekly and monthly reviews stay free at </w:t>
       </w:r>
       <w:hyperlink r:id="rId10">
         <w:r>

</xml_diff>

<commit_message>
Reviews + Signal: always cover all three asset classes, never drop one
If a feed (yfinance FX/commodities, or crypto) fails to return, the class was
silently omitted from the Signal, daily, weekly and monthly. Now each generator
emits a short fallback line per class instead of dropping it, and the Signal's
week-behind no longer IndexErrors on an empty FX/commodity feed.

Co-Authored-By: Claude Opus 4.8 <noreply@anthropic.com>
</commit_message>
<xml_diff>
--- a/reports/signals/docx/levanter-signal-2026-08-24.docx
+++ b/reports/signals/docx/levanter-signal-2026-08-24.docx
@@ -41,7 +41,7 @@
         <w:rPr>
           <w:i/>
         </w:rPr>
-        <w:t>Data captured at 10:16 GST on 25 August 2026. Every figure below is stamped to a period. This is the accountable read behind the free weekly: the changes since last week, the levels to watch, and a claim we will score in the next issue.</w:t>
+        <w:t>Data captured at 12:03 GST on 25 August 2026. Every figure below is stamped to a period. This is the accountable read behind the free weekly: the changes since last week, the levels to watch, and a claim we will score in the next issue.</w:t>
       </w:r>
     </w:p>
     <w:p/>
@@ -167,7 +167,7 @@
     </w:p>
     <w:p>
       <w:r>
-        <w:t>Over the past seven days crypto was broad and speculative-led: 32 of 35 coins higher, cap-weighted about +27 percent on the week and +26 percent over thirty days, led by the speculative end, PUMP +77 percent and ZEC +67 percent, with a best-to-worst spread near 80 points. Dominance held near 68 percent and the stablecoins we track kept their pegs. In foreign exchange the biggest seven-day move was AUDJPY at +1.0 percent, ranges otherwise tight. In commodities the metals led the week, platinum +8 percent, gold +7 percent and silver +6 percent. The gains were broad, but the largest moves stayed further out on the risk curve, and the dollar and most FX ranges were comparatively quiet.</w:t>
+        <w:t>Over the past seven days crypto was broad and speculative-led: 32 of 35 coins higher, cap-weighted about +27 percent on the week and +26 percent over thirty days, led by the speculative end, PUMP +71 percent and ZEC +68 percent, with a best-to-worst spread near 76 points. Dominance held near 68 percent and the stablecoins we track kept their pegs. In foreign exchange the biggest seven-day move was AUDJPY at +1.0 percent, ranges otherwise tight. In commodities the metals led the week, platinum +8 percent, gold +7 percent and silver +6 percent. The gains were broad, but the largest moves stayed further out on the risk curve, and the dollar and most FX ranges were comparatively quiet.</w:t>
       </w:r>
     </w:p>
     <w:p>

</xml_diff>